<commit_message>
Los decks de clase llevan solo el tema: taller y actividades evaluativas quedan en la carpeta
Co-Authored-By: Claude Opus 5.5 <noreply@anthropic.com>
</commit_message>
<xml_diff>
--- a/Arquitectura de Sistemas Computacionales/Kit docente/Clase 1/Guion Docente Clase 1 - Introduccion a arquitecturas cloud.docx
+++ b/Arquitectura de Sistemas Computacionales/Kit docente/Clase 1/Guion Docente Clase 1 - Introduccion a arquitecturas cloud.docx
@@ -284,7 +284,7 @@
           <w:color w:val="4A4A49"/>
           <w:sz w:val="22"/>
         </w:rPr>
-        <w:t>[Slide 7] PI CloudLite - entregable de hoy: la ficha de 6 bloques (1/2)</w:t>
+        <w:t>[Slide 7] La ficha de dominio de 6 bloques (1/2)</w:t>
       </w:r>
       <w:r>
         <w:rPr>
@@ -328,7 +328,7 @@
           <w:color w:val="4A4A49"/>
           <w:sz w:val="22"/>
         </w:rPr>
-        <w:t>[Slide 8] PI CloudLite - entregable de hoy: la ficha de 6 bloques (2/2)</w:t>
+        <w:t>[Slide 8] La ficha de dominio de 6 bloques (2/2)</w:t>
       </w:r>
       <w:r>
         <w:rPr>
@@ -880,7 +880,7 @@
           <w:color w:val="4A4A49"/>
           <w:sz w:val="22"/>
         </w:rPr>
-        <w:t>PI CloudLite - entregable de hoy: la ficha de 6 bloques (1/2)</w:t>
+        <w:t>La ficha de dominio de 6 bloques (1/2)</w:t>
       </w:r>
     </w:p>
     <w:p>
@@ -893,7 +893,7 @@
           <w:color w:val="4A4A49"/>
           <w:sz w:val="22"/>
         </w:rPr>
-        <w:t>PI CloudLite - entregable de hoy: la ficha de 6 bloques (2/2)</w:t>
+        <w:t>La ficha de dominio de 6 bloques (2/2)</w:t>
       </w:r>
     </w:p>
     <w:p>
@@ -1088,72 +1088,7 @@
           <w:color w:val="4A4A49"/>
           <w:sz w:val="22"/>
         </w:rPr>
-        <w:t>Herramientas de hoy</w:t>
-      </w:r>
-    </w:p>
-    <w:p>
-      <w:pPr>
-        <w:pStyle w:val="ListNumber"/>
-      </w:pPr>
-      <w:r>
-        <w:rPr>
-          <w:b w:val="0"/>
-          <w:color w:val="4A4A49"/>
-          <w:sz w:val="22"/>
-        </w:rPr>
-        <w:t>Del boceto a la plataforma del curso (diagrama)</w:t>
-      </w:r>
-    </w:p>
-    <w:p>
-      <w:pPr>
-        <w:pStyle w:val="ListNumber"/>
-      </w:pPr>
-      <w:r>
-        <w:rPr>
-          <w:b w:val="0"/>
-          <w:color w:val="4A4A49"/>
-          <w:sz w:val="22"/>
-        </w:rPr>
-        <w:t>PI CloudLite — entregable de hoy</w:t>
-      </w:r>
-    </w:p>
-    <w:p>
-      <w:pPr>
-        <w:pStyle w:val="ListNumber"/>
-      </w:pPr>
-      <w:r>
-        <w:rPr>
-          <w:b w:val="0"/>
-          <w:color w:val="4A4A49"/>
-          <w:sz w:val="22"/>
-        </w:rPr>
-        <w:t>Manos a la obra (paso a paso)</w:t>
-      </w:r>
-    </w:p>
-    <w:p>
-      <w:pPr>
-        <w:pStyle w:val="ListNumber"/>
-      </w:pPr>
-      <w:r>
-        <w:rPr>
-          <w:b w:val="0"/>
-          <w:color w:val="4A4A49"/>
-          <w:sz w:val="22"/>
-        </w:rPr>
-        <w:t>Para continuar (PI)</w:t>
-      </w:r>
-    </w:p>
-    <w:p>
-      <w:pPr>
-        <w:pStyle w:val="ListNumber"/>
-      </w:pPr>
-      <w:r>
-        <w:rPr>
-          <w:b w:val="0"/>
-          <w:color w:val="4A4A49"/>
-          <w:sz w:val="22"/>
-        </w:rPr>
-        <w:t>Clase 1 · PI en movimiento</w:t>
+        <w:t>Clase 1 · cierre conceptual</w:t>
       </w:r>
     </w:p>
     <w:p>
@@ -1179,7 +1114,7 @@
           <w:color w:val="1A1C1D"/>
           <w:sz w:val="32"/>
         </w:rPr>
-        <w:t>0–10 · Encuadre PI · [Slide 2][Slide 3][Slide 7]</w:t>
+        <w:t>0–10 · Encuadre PI · [Slide 2][Slide 3]</w:t>
       </w:r>
     </w:p>
     <w:p>
@@ -1430,7 +1365,7 @@
           <w:color w:val="1A1C1D"/>
           <w:sz w:val="32"/>
         </w:rPr>
-        <w:t>40–55 · Demo en vivo · [Slide 24]</w:t>
+        <w:t>40–55 · Demo en vivo</w:t>
       </w:r>
     </w:p>
     <w:p>
@@ -1734,7 +1669,7 @@
           <w:color w:val="4A4A49"/>
           <w:sz w:val="22"/>
         </w:rPr>
-        <w:t>Cierra la demo en la plataforma del curso</w:t>
+        <w:t>Si se hace el taller, cierra la demo en la plataforma del curso</w:t>
       </w:r>
       <w:r>
         <w:rPr>
@@ -1742,7 +1677,24 @@
           <w:color w:val="4A4A49"/>
           <w:sz w:val="22"/>
         </w:rPr>
-        <w:t xml:space="preserve"> [Slide 24] — es el paso que el estudiante no adivina: pasa el boceto a codigo Mermaid con ayuda de una IA, pegalo en la pregunta de diagrama y muestralo renderizado.</w:t>
+        <w:t xml:space="preserve"> (sin diapositiva: el flujo está en el </w:t>
+      </w:r>
+      <w:r>
+        <w:rPr>
+          <w:rFonts w:ascii="Consolas" w:hAnsi="Consolas"/>
+          <w:b w:val="0"/>
+          <w:color w:val="111111"/>
+          <w:sz w:val="21"/>
+        </w:rPr>
+        <w:t>Taller … .docx</w:t>
+      </w:r>
+      <w:r>
+        <w:rPr>
+          <w:b w:val="0"/>
+          <w:color w:val="4A4A49"/>
+          <w:sz w:val="22"/>
+        </w:rPr>
+        <w:t>) — es el paso que el estudiante no adivina: pasa el boceto a codigo Mermaid con ayuda de una IA, pegalo en la pregunta de diagrama y muestralo renderizado.</w:t>
       </w:r>
     </w:p>
     <w:p>
@@ -1927,7 +1879,7 @@
           <w:color w:val="1A1C1D"/>
           <w:sz w:val="32"/>
         </w:rPr>
-        <w:t>55–100 · Taller guiado PI (individual) · [Slide 26]</w:t>
+        <w:t>55–100 · Taller guiado PI (individual) · opcional · sin diapositiva</w:t>
       </w:r>
     </w:p>
     <w:p>
@@ -1945,7 +1897,32 @@
           <w:color w:val="4A4A49"/>
           <w:sz w:val="22"/>
         </w:rPr>
-        <w:t xml:space="preserve"> proyecta la lista de pasos del taller del estudiante (está en la sección «Actividad / taller»</w:t>
+        <w:t xml:space="preserve"> el taller es </w:t>
+      </w:r>
+      <w:r>
+        <w:rPr>
+          <w:b/>
+          <w:color w:val="4A4A49"/>
+          <w:sz w:val="22"/>
+        </w:rPr>
+        <w:t>opcional</w:t>
+      </w:r>
+      <w:r>
+        <w:rPr>
+          <w:b w:val="0"/>
+          <w:color w:val="4A4A49"/>
+          <w:sz w:val="22"/>
+        </w:rPr>
+        <w:t xml:space="preserve"> y ya no está en el deck: si se hace hoy, comparte el </w:t>
+      </w:r>
+      <w:r>
+        <w:rPr>
+          <w:rFonts w:ascii="Consolas" w:hAnsi="Consolas"/>
+          <w:b w:val="0"/>
+          <w:color w:val="111111"/>
+          <w:sz w:val="21"/>
+        </w:rPr>
+        <w:t>Taller … .docx</w:t>
       </w:r>
     </w:p>
     <w:p>
@@ -1955,7 +1932,24 @@
           <w:color w:val="4A4A49"/>
           <w:sz w:val="22"/>
         </w:rPr>
-        <w:t>de este guion). Circula por mesas/Meet con la lista de errores frecuentes de abajo en la mano: son los que vas</w:t>
+        <w:t xml:space="preserve">de </w:t>
+      </w:r>
+      <w:r>
+        <w:rPr>
+          <w:rFonts w:ascii="Consolas" w:hAnsi="Consolas"/>
+          <w:b w:val="0"/>
+          <w:color w:val="111111"/>
+          <w:sz w:val="21"/>
+        </w:rPr>
+        <w:t>Clases/Clase 1 - Introduccion a arquitecturas cloud/</w:t>
+      </w:r>
+      <w:r>
+        <w:rPr>
+          <w:b w:val="0"/>
+          <w:color w:val="4A4A49"/>
+          <w:sz w:val="22"/>
+        </w:rPr>
+        <w:t xml:space="preserve"> (los pasos también están en la sección «Actividad / taller» de este guion). Circula por mesas/Meet con la lista de errores frecuentes de abajo en la mano: son los que vas</w:t>
       </w:r>
     </w:p>
     <w:p>
@@ -2099,7 +2093,7 @@
           <w:color w:val="1A1C1D"/>
           <w:sz w:val="32"/>
         </w:rPr>
-        <w:t>115–120 · Cierre · [Slide 28]</w:t>
+        <w:t>115–120 · Cierre · [Slide 23]</w:t>
       </w:r>
     </w:p>
     <w:p>

</xml_diff>

<commit_message>
Laminas de concepto sin actividad ni plataforma, parciales genericos y logistica de Seminario C1 a notas
Co-Authored-By: Claude Opus 5.5 <noreply@anthropic.com>
</commit_message>
<xml_diff>
--- a/Arquitectura de Sistemas Computacionales/Kit docente/Clase 1/Guion Docente Clase 1 - Introduccion a arquitecturas cloud.docx
+++ b/Arquitectura de Sistemas Computacionales/Kit docente/Clase 1/Guion Docente Clase 1 - Introduccion a arquitecturas cloud.docx
@@ -318,7 +318,7 @@
           <w:color w:val="4A4A49"/>
           <w:sz w:val="22"/>
         </w:rPr>
-        <w:t>SISTEMAS EXTERNOS es el bloque nuevo de este semestre: dos o tres sistemas de terceros con los que CloudLite intercambia informacion (un proveedor de identidad, un servicio de correo, una pasarela de pagos); es exactamente lo que despues aparece como System_Ext en el diagrama C4 Context de la pregunta 2 de la plataforma del curso, asi que conviene que el estudiante los escriba aqui ANTES de dibujar, no despues.</w:t>
+        <w:t>SISTEMAS EXTERNOS es el bloque nuevo de este semestre: dos o tres sistemas de terceros con los que CloudLite intercambia informacion (un proveedor de identidad, un servicio de correo, una pasarela de pagos); es exactamente lo que despues aparece como System_Ext en el diagrama C4 Context, asi que conviene que el estudiante los escriba aqui ANTES de dibujar, no despues.</w:t>
       </w:r>
     </w:p>
     <w:p>
@@ -504,7 +504,7 @@
           <w:color w:val="4A4A49"/>
           <w:sz w:val="22"/>
         </w:rPr>
-        <w:t xml:space="preserve"> — 4 vinetas.</w:t>
+        <w:t xml:space="preserve"> — 3 vinetas.</w:t>
       </w:r>
     </w:p>
     <w:p>
@@ -548,7 +548,7 @@
           <w:color w:val="4A4A49"/>
           <w:sz w:val="22"/>
         </w:rPr>
-        <w:t xml:space="preserve"> — 2 vinetas.</w:t>
+        <w:t xml:space="preserve"> — 3 vinetas.</w:t>
       </w:r>
     </w:p>
     <w:p>
@@ -633,7 +633,20 @@
           <w:color w:val="4A4A49"/>
           <w:sz w:val="22"/>
         </w:rPr>
-        <w:t xml:space="preserve"> — 3 vinetas.</w:t>
+        <w:t xml:space="preserve"> — 2 vinetas.</w:t>
+      </w:r>
+    </w:p>
+    <w:p>
+      <w:pPr>
+        <w:pStyle w:val="ListBullet2"/>
+      </w:pPr>
+      <w:r>
+        <w:rPr>
+          <w:b w:val="0"/>
+          <w:color w:val="4A4A49"/>
+          <w:sz w:val="22"/>
+        </w:rPr>
+        <w:t>(Sobre la actividad, no se proyecta) Es el mismo modelo C4 explicado arriba, ahora aplicado con nombres concretos, y sirve de puente directo hacia la pregunta 2 del taller en la plataforma del curso (el diagrama Mermaid que cada estudiante entrega hoy).</w:t>
       </w:r>
     </w:p>
     <w:p>
@@ -1088,6 +1101,19 @@
           <w:color w:val="4A4A49"/>
           <w:sz w:val="22"/>
         </w:rPr>
+        <w:t>Del boceto al código Mermaid</w:t>
+      </w:r>
+    </w:p>
+    <w:p>
+      <w:pPr>
+        <w:pStyle w:val="ListNumber"/>
+      </w:pPr>
+      <w:r>
+        <w:rPr>
+          <w:b w:val="0"/>
+          <w:color w:val="4A4A49"/>
+          <w:sz w:val="22"/>
+        </w:rPr>
         <w:t>Clase 1 · cierre conceptual</w:t>
       </w:r>
     </w:p>
@@ -1365,7 +1391,7 @@
           <w:color w:val="1A1C1D"/>
           <w:sz w:val="32"/>
         </w:rPr>
-        <w:t>40–55 · Demo en vivo</w:t>
+        <w:t>40–55 · Demo en vivo · [Slide 23]</w:t>
       </w:r>
     </w:p>
     <w:p>
@@ -2093,7 +2119,7 @@
           <w:color w:val="1A1C1D"/>
           <w:sz w:val="32"/>
         </w:rPr>
-        <w:t>115–120 · Cierre · [Slide 23]</w:t>
+        <w:t>115–120 · Cierre · [Slide 24]</w:t>
       </w:r>
     </w:p>
     <w:p>

</xml_diff>

<commit_message>
Laminas de concepto de Arquitectura y BD II completadas a 400+ caracteres, y BD II sin sintaxis Oracle
Co-Authored-By: Claude Opus 5.5 <noreply@anthropic.com>
</commit_message>
<xml_diff>
--- a/Arquitectura de Sistemas Computacionales/Kit docente/Clase 1/Guion Docente Clase 1 - Introduccion a arquitecturas cloud.docx
+++ b/Arquitectura de Sistemas Computacionales/Kit docente/Clase 1/Guion Docente Clase 1 - Introduccion a arquitecturas cloud.docx
@@ -633,7 +633,20 @@
           <w:color w:val="4A4A49"/>
           <w:sz w:val="22"/>
         </w:rPr>
-        <w:t xml:space="preserve"> — 2 vinetas.</w:t>
+        <w:t xml:space="preserve"> — 4 vinetas.</w:t>
+      </w:r>
+    </w:p>
+    <w:p>
+      <w:pPr>
+        <w:pStyle w:val="ListBullet2"/>
+      </w:pPr>
+      <w:r>
+        <w:rPr>
+          <w:b w:val="0"/>
+          <w:color w:val="4A4A49"/>
+          <w:sz w:val="22"/>
+        </w:rPr>
+        <w:t>En el diagrama proyectado (System, dos Person, System_Ext) el nivel Context muestra el sistema como UNA sola caja, sin abrir por dentro.</w:t>
       </w:r>
     </w:p>
     <w:p>

</xml_diff>

<commit_message>
Codigo del Kit igual al proyectado, frases al docente a notas y laminas sin evaluacion en los cinco cursos
Co-Authored-By: Claude Opus 5.5 <noreply@anthropic.com>
</commit_message>
<xml_diff>
--- a/Arquitectura de Sistemas Computacionales/Kit docente/Clase 1/Guion Docente Clase 1 - Introduccion a arquitecturas cloud.docx
+++ b/Arquitectura de Sistemas Computacionales/Kit docente/Clase 1/Guion Docente Clase 1 - Introduccion a arquitecturas cloud.docx
@@ -318,7 +318,7 @@
           <w:color w:val="4A4A49"/>
           <w:sz w:val="22"/>
         </w:rPr>
-        <w:t>SISTEMAS EXTERNOS es el bloque nuevo de este semestre: dos o tres sistemas de terceros con los que CloudLite intercambia informacion (un proveedor de identidad, un servicio de correo, una pasarela de pagos); es exactamente lo que despues aparece como System_Ext en el diagrama C4 Context, asi que conviene que el estudiante los escriba aqui ANTES de dibujar, no despues.</w:t>
+        <w:t>(No se proyecta) SISTEMAS EXTERNOS es el bloque nuevo de este semestre: dos o tres sistemas de terceros con los que CloudLite intercambia informacion (un proveedor de identidad, un servicio de correo, una pasarela de pagos); es exactamente lo que despues aparece como System_Ext en el diagrama C4 Context, asi que conviene que el estudiante los escriba aqui ANTES de dibujar, no despues.</w:t>
       </w:r>
     </w:p>
     <w:p>
@@ -346,7 +346,7 @@
           <w:color w:val="4A4A49"/>
           <w:sz w:val="22"/>
         </w:rPr>
-        <w:t>[Slide 9] Que es arquitectura cloud (mapa mental) (1/4)</w:t>
+        <w:t>[Slide 9] Que es arquitectura cloud (mapa mental) (1/3)</w:t>
       </w:r>
       <w:r>
         <w:rPr>
@@ -354,33 +354,7 @@
           <w:color w:val="4A4A49"/>
           <w:sz w:val="22"/>
         </w:rPr>
-        <w:t xml:space="preserve"> — 6 vinetas.</w:t>
-      </w:r>
-    </w:p>
-    <w:p>
-      <w:pPr>
-        <w:pStyle w:val="ListBullet2"/>
-      </w:pPr>
-      <w:r>
-        <w:rPr>
-          <w:b w:val="0"/>
-          <w:color w:val="4A4A49"/>
-          <w:sz w:val="22"/>
-        </w:rPr>
-        <w:t>Esa asimetria de costo es la razon de existir de la materia: si el docente no la instala el primer dia, el curso se percibe como una coleccion de diagramas decorativos y el estudiante concluye que la arquitectura es documentacion que se produce para la nota.</w:t>
-      </w:r>
-    </w:p>
-    <w:p>
-      <w:pPr>
-        <w:pStyle w:val="ListBullet2"/>
-      </w:pPr>
-      <w:r>
-        <w:rPr>
-          <w:b w:val="0"/>
-          <w:color w:val="4A4A49"/>
-          <w:sz w:val="22"/>
-        </w:rPr>
-        <w:t>Conviene separar de entrada dos cosas que el estudiante confunde siempre: el stack tecnologico y la arquitectura.</w:t>
+        <w:t xml:space="preserve"> — 5 vinetas.</w:t>
       </w:r>
     </w:p>
     <w:p>
@@ -432,7 +406,85 @@
           <w:color w:val="4A4A49"/>
           <w:sz w:val="22"/>
         </w:rPr>
-        <w:t>Por eso en la nube el costo se convierte en un atributo de calidad tecnico y no solo administrativo, idea que el curso retoma de forma explicita en la Clase 10.</w:t>
+        <w:t>(No se proyecta) Esa asimetria de costo es la razon de existir de la materia: si el docente no la instala el primer dia, el curso se percibe como una coleccion de diagramas decorativos y el estudiante concluye que la arquitectura es documentacion que se produce para la nota.</w:t>
+      </w:r>
+    </w:p>
+    <w:p>
+      <w:pPr>
+        <w:pStyle w:val="ListBullet2"/>
+      </w:pPr>
+      <w:r>
+        <w:rPr>
+          <w:b w:val="0"/>
+          <w:color w:val="4A4A49"/>
+          <w:sz w:val="22"/>
+        </w:rPr>
+        <w:t>(No se proyecta) Conviene separar de entrada dos cosas que el estudiante confunde siempre: el stack tecnologico y la arquitectura.</w:t>
+      </w:r>
+    </w:p>
+    <w:p>
+      <w:pPr>
+        <w:pStyle w:val="ListBullet2"/>
+      </w:pPr>
+      <w:r>
+        <w:rPr>
+          <w:b w:val="0"/>
+          <w:color w:val="4A4A49"/>
+          <w:sz w:val="22"/>
+        </w:rPr>
+        <w:t>(No se proyecta) Una forma rapida de demostrarlo es escribir en el tablero «React + Node + PostgreSQL» y preguntar al curso cuantos usuarios simultaneos soporta eso, o que ocurre si la base de datos deja de responder.</w:t>
+      </w:r>
+    </w:p>
+    <w:p>
+      <w:pPr>
+        <w:pStyle w:val="ListBullet2"/>
+      </w:pPr>
+      <w:r>
+        <w:rPr>
+          <w:b w:val="0"/>
+          <w:color w:val="4A4A49"/>
+          <w:sz w:val="22"/>
+        </w:rPr>
+        <w:t>(No se proyecta) Rendimiento se expresa en tiempo de respuesta: una convencion de usabilidad ampliamente aceptada dice que una interaccion web se siente inmediata por debajo de 100 milisegundos, aceptable hasta unos 300 y claramente lenta por encima de 1 segundo; son convenciones, no leyes fisicas, y conviene decirlo asi.</w:t>
+      </w:r>
+    </w:p>
+    <w:p>
+      <w:pPr>
+        <w:pStyle w:val="ListBullet2"/>
+      </w:pPr>
+      <w:r>
+        <w:rPr>
+          <w:b w:val="0"/>
+          <w:color w:val="4A4A49"/>
+          <w:sz w:val="22"/>
+        </w:rPr>
+        <w:t>(No se proyecta) Vale hacer ese calculo en el tablero, porque 43 minutos al mes es un dato que el estudiante recuerda, mientras que la expresion «alta disponibilidad» no significa nada.</w:t>
+      </w:r>
+    </w:p>
+    <w:p>
+      <w:pPr>
+        <w:pStyle w:val="ListBullet2"/>
+      </w:pPr>
+      <w:r>
+        <w:rPr>
+          <w:b w:val="0"/>
+          <w:color w:val="4A4A49"/>
+          <w:sz w:val="22"/>
+        </w:rPr>
+        <w:t>(No se proyecta) Es un modelo operativo con cinco rasgos que conviene enunciar tal cual, porque son el estandar con el que se define el termino: autoservicio bajo demanda, es decir que quien necesita recursos los aprovisiona sin pedir permiso ni esperar dias; acceso amplio por red; agrupacion de recursos, donde el proveedor comparte hardware fisico entre muchos clientes mediante virtualizacion, tema de la Clase 3; elasticidad rapida, con capacidad que sube y baja en minutos y no en semanas; y medicion del servicio, o pago por lo consumido.</w:t>
+      </w:r>
+    </w:p>
+    <w:p>
+      <w:pPr>
+        <w:pStyle w:val="ListBullet2"/>
+      </w:pPr>
+      <w:r>
+        <w:rPr>
+          <w:b w:val="0"/>
+          <w:color w:val="4A4A49"/>
+          <w:sz w:val="22"/>
+        </w:rPr>
+        <w:t>(No se proyecta) Por eso en la nube el costo se convierte en un atributo de calidad tecnico y no solo administrativo, idea que el curso retoma de forma explicita en la Clase 10.</w:t>
       </w:r>
     </w:p>
     <w:p>
@@ -442,7 +494,7 @@
           <w:color w:val="4A4A49"/>
           <w:sz w:val="22"/>
         </w:rPr>
-        <w:t>[Slide 10] Que es arquitectura cloud (mapa mental) (2/4)</w:t>
+        <w:t>[Slide 10] Que es arquitectura cloud (mapa mental) (2/3)</w:t>
       </w:r>
       <w:r>
         <w:rPr>
@@ -450,7 +502,7 @@
           <w:color w:val="4A4A49"/>
           <w:sz w:val="22"/>
         </w:rPr>
-        <w:t xml:space="preserve"> — 5 vinetas.</w:t>
+        <w:t xml:space="preserve"> — 4 vinetas.</w:t>
       </w:r>
     </w:p>
     <w:p>
@@ -460,7 +512,7 @@
           <w:color w:val="4A4A49"/>
           <w:sz w:val="22"/>
         </w:rPr>
-        <w:t>[Slide 11] Que es arquitectura cloud (mapa mental) (3/4)</w:t>
+        <w:t>[Slide 11] Que es arquitectura cloud (mapa mental) (3/3)</w:t>
       </w:r>
       <w:r>
         <w:rPr>
@@ -468,7 +520,7 @@
           <w:color w:val="4A4A49"/>
           <w:sz w:val="22"/>
         </w:rPr>
-        <w:t xml:space="preserve"> — 5 vinetas.</w:t>
+        <w:t xml:space="preserve"> — 2 vinetas.</w:t>
       </w:r>
     </w:p>
     <w:p>
@@ -478,7 +530,7 @@
           <w:color w:val="4A4A49"/>
           <w:sz w:val="22"/>
         </w:rPr>
-        <w:t>[Slide 12] Que es arquitectura cloud (mapa mental) (4/4)</w:t>
+        <w:t>[Slide 12] CloudLite App - el hilo conductor</w:t>
       </w:r>
       <w:r>
         <w:rPr>
@@ -486,25 +538,7 @@
           <w:color w:val="4A4A49"/>
           <w:sz w:val="22"/>
         </w:rPr>
-        <w:t xml:space="preserve"> — 3 vinetas.</w:t>
-      </w:r>
-    </w:p>
-    <w:p>
-      <w:r>
-        <w:rPr>
-          <w:b/>
-          <w:color w:val="4A4A49"/>
-          <w:sz w:val="22"/>
-        </w:rPr>
-        <w:t>[Slide 13] CloudLite App - el hilo conductor (1/2)</w:t>
-      </w:r>
-      <w:r>
-        <w:rPr>
-          <w:b w:val="0"/>
-          <w:color w:val="4A4A49"/>
-          <w:sz w:val="22"/>
-        </w:rPr>
-        <w:t xml:space="preserve"> — 3 vinetas.</w:t>
+        <w:t xml:space="preserve"> — 5 vinetas.</w:t>
       </w:r>
     </w:p>
     <w:p>
@@ -534,13 +568,88 @@
       </w:r>
     </w:p>
     <w:p>
+      <w:pPr>
+        <w:pStyle w:val="ListBullet2"/>
+      </w:pPr>
+      <w:r>
+        <w:rPr>
+          <w:b w:val="0"/>
+          <w:color w:val="4A4A49"/>
+          <w:sz w:val="22"/>
+        </w:rPr>
+        <w:t>(No se proyecta) El valor de ese diagrama de cinco o seis elementos esta en que obliga a responder dos preguntas que el estudiante no se habia hecho: quien exactamente usa esto y de que terceros depende para funcionar.</w:t>
+      </w:r>
+    </w:p>
+    <w:p>
       <w:r>
         <w:rPr>
           <w:b/>
           <w:color w:val="4A4A49"/>
           <w:sz w:val="22"/>
         </w:rPr>
-        <w:t>[Slide 14] CloudLite App - el hilo conductor (2/2)</w:t>
+        <w:t>[Slide 13] De dominio a arquitectura (mini-metodo) (1/3)</w:t>
+      </w:r>
+      <w:r>
+        <w:rPr>
+          <w:b w:val="0"/>
+          <w:color w:val="4A4A49"/>
+          <w:sz w:val="22"/>
+        </w:rPr>
+        <w:t xml:space="preserve"> — 4 vinetas.</w:t>
+      </w:r>
+    </w:p>
+    <w:p>
+      <w:pPr>
+        <w:pStyle w:val="ListBullet2"/>
+      </w:pPr>
+      <w:r>
+        <w:rPr>
+          <w:b w:val="0"/>
+          <w:color w:val="4A4A49"/>
+          <w:sz w:val="22"/>
+        </w:rPr>
+        <w:t>Un problema sin afectado concreto y sin magnitud produce arquitecturas que nadie puede evaluar, porque no hay contra que comparar.</w:t>
+      </w:r>
+    </w:p>
+    <w:p>
+      <w:pPr>
+        <w:pStyle w:val="ListBullet2"/>
+      </w:pPr>
+      <w:r>
+        <w:rPr>
+          <w:b w:val="0"/>
+          <w:color w:val="4A4A49"/>
+          <w:sz w:val="22"/>
+        </w:rPr>
+        <w:t>(No se proyecta) Hoy se trabaja unicamente el nivel 1, y la regla es estricta: si en el diagrama de contexto aparecen las palabras PostgreSQL, Docker o Redis, el diagrama esta mal, porque eso es interior del sistema y corresponde al nivel 2 de la Clase 4.</w:t>
+      </w:r>
+    </w:p>
+    <w:p>
+      <w:r>
+        <w:rPr>
+          <w:b/>
+          <w:color w:val="4A4A49"/>
+          <w:sz w:val="22"/>
+        </w:rPr>
+        <w:t>[Slide 14] De dominio a arquitectura (mini-metodo) (2/3)</w:t>
+      </w:r>
+      <w:r>
+        <w:rPr>
+          <w:b w:val="0"/>
+          <w:color w:val="4A4A49"/>
+          <w:sz w:val="22"/>
+        </w:rPr>
+        <w:t xml:space="preserve"> — 4 vinetas.</w:t>
+      </w:r>
+    </w:p>
+    <w:p>
+      <w:r>
+        <w:rPr>
+          <w:b/>
+          <w:color w:val="4A4A49"/>
+          <w:sz w:val="22"/>
+        </w:rPr>
+        <w:t>[Slide 15] De dominio a arquitectura (mini-metodo) (3/3)</w:t>
       </w:r>
       <w:r>
         <w:rPr>
@@ -558,74 +667,7 @@
           <w:color w:val="4A4A49"/>
           <w:sz w:val="22"/>
         </w:rPr>
-        <w:t>[Slide 15] De dominio a arquitectura (mini-metodo) (1/3)</w:t>
-      </w:r>
-      <w:r>
-        <w:rPr>
-          <w:b w:val="0"/>
-          <w:color w:val="4A4A49"/>
-          <w:sz w:val="22"/>
-        </w:rPr>
-        <w:t xml:space="preserve"> — 5 vinetas.</w:t>
-      </w:r>
-    </w:p>
-    <w:p>
-      <w:pPr>
-        <w:pStyle w:val="ListBullet2"/>
-      </w:pPr>
-      <w:r>
-        <w:rPr>
-          <w:b w:val="0"/>
-          <w:color w:val="4A4A49"/>
-          <w:sz w:val="22"/>
-        </w:rPr>
-        <w:t>Un problema sin afectado concreto y sin magnitud produce arquitecturas que nadie puede evaluar, porque no hay contra que comparar.</w:t>
-      </w:r>
-    </w:p>
-    <w:p>
-      <w:r>
-        <w:rPr>
-          <w:b/>
-          <w:color w:val="4A4A49"/>
-          <w:sz w:val="22"/>
-        </w:rPr>
-        <w:t>[Slide 16] De dominio a arquitectura (mini-metodo) (2/3)</w:t>
-      </w:r>
-      <w:r>
-        <w:rPr>
-          <w:b w:val="0"/>
-          <w:color w:val="4A4A49"/>
-          <w:sz w:val="22"/>
-        </w:rPr>
-        <w:t xml:space="preserve"> — 4 vinetas.</w:t>
-      </w:r>
-    </w:p>
-    <w:p>
-      <w:r>
-        <w:rPr>
-          <w:b/>
-          <w:color w:val="4A4A49"/>
-          <w:sz w:val="22"/>
-        </w:rPr>
-        <w:t>[Slide 17] De dominio a arquitectura (mini-metodo) (3/3)</w:t>
-      </w:r>
-      <w:r>
-        <w:rPr>
-          <w:b w:val="0"/>
-          <w:color w:val="4A4A49"/>
-          <w:sz w:val="22"/>
-        </w:rPr>
-        <w:t xml:space="preserve"> — 3 vinetas.</w:t>
-      </w:r>
-    </w:p>
-    <w:p>
-      <w:r>
-        <w:rPr>
-          <w:b/>
-          <w:color w:val="4A4A49"/>
-          <w:sz w:val="22"/>
-        </w:rPr>
-        <w:t>[Slide 18] Ejemplo de diagrama C4 - nivel Context</w:t>
+        <w:t>[Slide 16] Ejemplo de diagrama C4 - nivel Context</w:t>
       </w:r>
       <w:r>
         <w:rPr>
@@ -659,7 +701,7 @@
           <w:color w:val="4A4A49"/>
           <w:sz w:val="22"/>
         </w:rPr>
-        <w:t>(Sobre la actividad, no se proyecta) Es el mismo modelo C4 explicado arriba, ahora aplicado con nombres concretos, y sirve de puente directo hacia la pregunta 2 del taller en la plataforma del curso (el diagrama Mermaid que cada estudiante entrega hoy).</w:t>
+        <w:t>(No se proyecta) Es el mismo modelo C4 explicado arriba, ahora aplicado con nombres concretos, y sirve de puente directo hacia la pregunta 2 del taller en la plataforma del curso (el diagrama Mermaid que cada estudiante entrega hoy).</w:t>
       </w:r>
     </w:p>
     <w:p>
@@ -669,7 +711,7 @@
           <w:color w:val="4A4A49"/>
           <w:sz w:val="22"/>
         </w:rPr>
-        <w:t>[Slide 19] Preguntas frecuentes y cierre conceptual () (1/3)</w:t>
+        <w:t>[Slide 17] Preguntas frecuentes y cierre conceptual (1/2)</w:t>
       </w:r>
       <w:r>
         <w:rPr>
@@ -677,20 +719,7 @@
           <w:color w:val="4A4A49"/>
           <w:sz w:val="22"/>
         </w:rPr>
-        <w:t xml:space="preserve"> — 5 vinetas.</w:t>
-      </w:r>
-    </w:p>
-    <w:p>
-      <w:pPr>
-        <w:pStyle w:val="ListBullet2"/>
-      </w:pPr>
-      <w:r>
-        <w:rPr>
-          <w:b w:val="0"/>
-          <w:color w:val="4A4A49"/>
-          <w:sz w:val="22"/>
-        </w:rPr>
-        <w:t>Tres preguntas aparecen casi siempre en esta primera clase y conviene tener la respuesta lista.</w:t>
+        <w:t xml:space="preserve"> — 4 vinetas.</w:t>
       </w:r>
     </w:p>
     <w:p>
@@ -707,39 +736,13 @@
       </w:r>
     </w:p>
     <w:p>
-      <w:pPr>
-        <w:pStyle w:val="ListBullet2"/>
-      </w:pPr>
-      <w:r>
-        <w:rPr>
-          <w:b w:val="0"/>
-          <w:color w:val="4A4A49"/>
-          <w:sz w:val="22"/>
-        </w:rPr>
-        <w:t>Lo que se decida hoy (dominio, actores, capacidades, problema) es la entrada obligatoria de la Clase 2, que se dicta la semana siguiente en sesion virtual sincrona y pide elegir entre IaaS, PaaS y SaaS registrando la decision; de la Clase 3, donde se contenerizara uno de los servicios de este mismo sistema; y sobre todo de la Clase 4, que abre la caja negra dibujada hoy para mostrar de dos a cinco contenedores logicos.</w:t>
-      </w:r>
-    </w:p>
-    <w:p>
-      <w:pPr>
-        <w:pStyle w:val="ListBullet2"/>
-      </w:pPr>
-      <w:r>
-        <w:rPr>
-          <w:b w:val="0"/>
-          <w:color w:val="4A4A49"/>
-          <w:sz w:val="22"/>
-        </w:rPr>
-        <w:t>Conviene decirlo en voz alta al cerrar: el estudiante que salga hoy sin dominio definido no tiene sobre que trabajar en las siguientes cuatro sesiones, y el docente debe negarse a dejar el tema abierto para la proxima semana.</w:t>
-      </w:r>
-    </w:p>
-    <w:p>
       <w:r>
         <w:rPr>
           <w:b/>
           <w:color w:val="4A4A49"/>
           <w:sz w:val="22"/>
         </w:rPr>
-        <w:t>[Slide 20] Preguntas frecuentes y cierre conceptual () (2/3)</w:t>
+        <w:t>[Slide 18] Preguntas frecuentes y cierre conceptual (2/2)</w:t>
       </w:r>
       <w:r>
         <w:rPr>
@@ -747,25 +750,7 @@
           <w:color w:val="4A4A49"/>
           <w:sz w:val="22"/>
         </w:rPr>
-        <w:t xml:space="preserve"> — 6 vinetas.</w:t>
-      </w:r>
-    </w:p>
-    <w:p>
-      <w:r>
-        <w:rPr>
-          <w:b/>
-          <w:color w:val="4A4A49"/>
-          <w:sz w:val="22"/>
-        </w:rPr>
-        <w:t>[Slide 21] Preguntas frecuentes y cierre conceptual () (3/3)</w:t>
-      </w:r>
-      <w:r>
-        <w:rPr>
-          <w:b w:val="0"/>
-          <w:color w:val="4A4A49"/>
-          <w:sz w:val="22"/>
-        </w:rPr>
-        <w:t xml:space="preserve"> — 4 vinetas.</w:t>
+        <w:t xml:space="preserve"> — 3 vinetas.</w:t>
       </w:r>
     </w:p>
     <w:p>
@@ -932,7 +917,7 @@
           <w:color w:val="4A4A49"/>
           <w:sz w:val="22"/>
         </w:rPr>
-        <w:t>Que es arquitectura cloud (mapa mental) (1/4)</w:t>
+        <w:t>Que es arquitectura cloud (mapa mental) (1/3)</w:t>
       </w:r>
     </w:p>
     <w:p>
@@ -945,7 +930,7 @@
           <w:color w:val="4A4A49"/>
           <w:sz w:val="22"/>
         </w:rPr>
-        <w:t>Que es arquitectura cloud (mapa mental) (2/4)</w:t>
+        <w:t>Que es arquitectura cloud (mapa mental) (2/3)</w:t>
       </w:r>
     </w:p>
     <w:p>
@@ -958,7 +943,7 @@
           <w:color w:val="4A4A49"/>
           <w:sz w:val="22"/>
         </w:rPr>
-        <w:t>Que es arquitectura cloud (mapa mental) (3/4)</w:t>
+        <w:t>Que es arquitectura cloud (mapa mental) (3/3)</w:t>
       </w:r>
     </w:p>
     <w:p>
@@ -971,33 +956,7 @@
           <w:color w:val="4A4A49"/>
           <w:sz w:val="22"/>
         </w:rPr>
-        <w:t>Que es arquitectura cloud (mapa mental) (4/4)</w:t>
-      </w:r>
-    </w:p>
-    <w:p>
-      <w:pPr>
-        <w:pStyle w:val="ListNumber"/>
-      </w:pPr>
-      <w:r>
-        <w:rPr>
-          <w:b w:val="0"/>
-          <w:color w:val="4A4A49"/>
-          <w:sz w:val="22"/>
-        </w:rPr>
-        <w:t>CloudLite App - el hilo conductor (1/2)</w:t>
-      </w:r>
-    </w:p>
-    <w:p>
-      <w:pPr>
-        <w:pStyle w:val="ListNumber"/>
-      </w:pPr>
-      <w:r>
-        <w:rPr>
-          <w:b w:val="0"/>
-          <w:color w:val="4A4A49"/>
-          <w:sz w:val="22"/>
-        </w:rPr>
-        <w:t>CloudLite App - el hilo conductor (2/2)</w:t>
+        <w:t>CloudLite App - el hilo conductor</w:t>
       </w:r>
     </w:p>
     <w:p>
@@ -1062,7 +1021,7 @@
           <w:color w:val="4A4A49"/>
           <w:sz w:val="22"/>
         </w:rPr>
-        <w:t>Preguntas frecuentes y cierre conceptual () (1/3)</w:t>
+        <w:t>Preguntas frecuentes y cierre conceptual (1/2)</w:t>
       </w:r>
     </w:p>
     <w:p>
@@ -1075,20 +1034,7 @@
           <w:color w:val="4A4A49"/>
           <w:sz w:val="22"/>
         </w:rPr>
-        <w:t>Preguntas frecuentes y cierre conceptual () (2/3)</w:t>
-      </w:r>
-    </w:p>
-    <w:p>
-      <w:pPr>
-        <w:pStyle w:val="ListNumber"/>
-      </w:pPr>
-      <w:r>
-        <w:rPr>
-          <w:b w:val="0"/>
-          <w:color w:val="4A4A49"/>
-          <w:sz w:val="22"/>
-        </w:rPr>
-        <w:t>Preguntas frecuentes y cierre conceptual () (3/3)</w:t>
+        <w:t>Preguntas frecuentes y cierre conceptual (2/2)</w:t>
       </w:r>
     </w:p>
     <w:p>
@@ -1404,7 +1350,7 @@
           <w:color w:val="1A1C1D"/>
           <w:sz w:val="32"/>
         </w:rPr>
-        <w:t>40–55 · Demo en vivo · [Slide 23]</w:t>
+        <w:t>40–55 · Demo en vivo · [Slide 20]</w:t>
       </w:r>
     </w:p>
     <w:p>
@@ -2132,7 +2078,7 @@
           <w:color w:val="1A1C1D"/>
           <w:sz w:val="32"/>
         </w:rPr>
-        <w:t>115–120 · Cierre · [Slide 24]</w:t>
+        <w:t>115–120 · Cierre · [Slide 21]</w:t>
       </w:r>
     </w:p>
     <w:p>

</xml_diff>

<commit_message>
Modo creativo en los cinco cursos: animaciones por pasos, fotos, codigo como editor y visual minimo por lamina
Co-Authored-By: Claude Opus 5.5 <noreply@anthropic.com>
</commit_message>
<xml_diff>
--- a/Arquitectura de Sistemas Computacionales/Kit docente/Clase 1/Guion Docente Clase 1 - Introduccion a arquitecturas cloud.docx
+++ b/Arquitectura de Sistemas Computacionales/Kit docente/Clase 1/Guion Docente Clase 1 - Introduccion a arquitecturas cloud.docx
@@ -284,7 +284,7 @@
           <w:color w:val="4A4A49"/>
           <w:sz w:val="22"/>
         </w:rPr>
-        <w:t>[Slide 7] La ficha de dominio de 6 bloques (1/2)</w:t>
+        <w:t>[Slide 4] La ficha de dominio de 5 bloques</w:t>
       </w:r>
       <w:r>
         <w:rPr>
@@ -305,7 +305,7 @@
           <w:color w:val="4A4A49"/>
           <w:sz w:val="22"/>
         </w:rPr>
-        <w:t>DOMINIO fija en una linea el problema de negocio elegido (AgendaU, BiblioLite, InventarioLab, TurnosClinica, EventosCampus u otro del mismo tamano); un dominio generico (una red social, una tienda en linea sin mas detalle) hace imposible evaluar las decisiones de las clases siguientes, porque no hay nada concreto que arquitecturar.</w:t>
+        <w:t>DESARROLLO (para explicarlo, no se proyecta):</w:t>
       </w:r>
     </w:p>
     <w:p>
@@ -318,7 +318,98 @@
           <w:color w:val="4A4A49"/>
           <w:sz w:val="22"/>
         </w:rPr>
-        <w:t>(No se proyecta) SISTEMAS EXTERNOS es el bloque nuevo de este semestre: dos o tres sistemas de terceros con los que CloudLite intercambia informacion (un proveedor de identidad, un servicio de correo, una pasarela de pagos); es exactamente lo que despues aparece como System_Ext en el diagrama C4 Context, asi que conviene que el estudiante los escriba aqui ANTES de dibujar, no despues.</w:t>
+        <w:t>La ficha de dominio es individual, tiene cinco bloques rotulados y siempre en el mismo orden, y no vuelve a cambiar en el resto del semestre.</w:t>
+      </w:r>
+    </w:p>
+    <w:p>
+      <w:pPr>
+        <w:pStyle w:val="ListBullet2"/>
+      </w:pPr>
+      <w:r>
+        <w:rPr>
+          <w:b w:val="0"/>
+          <w:color w:val="4A4A49"/>
+          <w:sz w:val="22"/>
+        </w:rPr>
+        <w:t>PROBLEMA nombra en tres frases quien sufre la situacion, como se resuelve hoy sin el sistema y una cifra medible del dolor; sin esa cifra el problema es una opinion y no algo que un diseno pueda mejorar o empeorar de forma verificable.</w:t>
+      </w:r>
+    </w:p>
+    <w:p>
+      <w:pPr>
+        <w:pStyle w:val="ListBullet2"/>
+      </w:pPr>
+      <w:r>
+        <w:rPr>
+          <w:b w:val="0"/>
+          <w:color w:val="4A4A49"/>
+          <w:sz w:val="22"/>
+        </w:rPr>
+        <w:t>ACTORES son las personas que usan el sistema, cada una con una frase de que espera obtener, y en el mismo bloque los dos o tres sistemas externos con los que intercambia informacion (un proveedor de identidad, un servicio de correo, una pasarela de pagos)</w:t>
+      </w:r>
+    </w:p>
+    <w:p>
+      <w:pPr>
+        <w:pStyle w:val="ListBullet2"/>
+      </w:pPr>
+      <w:r>
+        <w:rPr>
+          <w:b w:val="0"/>
+          <w:color w:val="4A4A49"/>
+          <w:sz w:val="22"/>
+        </w:rPr>
+        <w:t>Esos sistemas externos son exactamente los que despues aparecen como System_Ext en el diagrama C4 Context, asi que se escriben aqui ANTES de dibujar.</w:t>
+      </w:r>
+    </w:p>
+    <w:p>
+      <w:pPr>
+        <w:pStyle w:val="ListBullet2"/>
+      </w:pPr>
+      <w:r>
+        <w:rPr>
+          <w:b w:val="0"/>
+          <w:color w:val="4A4A49"/>
+          <w:sz w:val="22"/>
+        </w:rPr>
+        <w:t>CAPACIDADES son los verbos de negocio que el sistema debe permitir (reservar, publicar, cancelar, notificar), nunca piezas tecnicas como login o cache, porque las capacidades describen el fin y la tecnologia es solo el medio.</w:t>
+      </w:r>
+    </w:p>
+    <w:p>
+      <w:pPr>
+        <w:pStyle w:val="ListBullet2"/>
+      </w:pPr>
+      <w:r>
+        <w:rPr>
+          <w:b w:val="0"/>
+          <w:color w:val="4A4A49"/>
+          <w:sz w:val="22"/>
+        </w:rPr>
+        <w:t>NOTAS:</w:t>
+      </w:r>
+    </w:p>
+    <w:p>
+      <w:pPr>
+        <w:pStyle w:val="ListBullet2"/>
+      </w:pPr>
+      <w:r>
+        <w:rPr>
+          <w:b w:val="0"/>
+          <w:color w:val="4A4A49"/>
+          <w:sz w:val="22"/>
+        </w:rPr>
+        <w:t>DOMINIO fija en una linea el problema de negocio elegido (AgendaU, BiblioLite, InventarioLab, TurnosClinica, EventosCampus u otro del mismo tamano); un dominio generico (una red social, una tienda en linea sin mas detalle) hace imposible evaluar las decisiones de las clases siguientes, porque no hay nada concreto que arquitecturar.</w:t>
+      </w:r>
+    </w:p>
+    <w:p>
+      <w:pPr>
+        <w:pStyle w:val="ListBullet2"/>
+      </w:pPr>
+      <w:r>
+        <w:rPr>
+          <w:b w:val="0"/>
+          <w:color w:val="4A4A49"/>
+          <w:sz w:val="22"/>
+        </w:rPr>
+        <w:t>FUERA DE ALCANCE cierra la ficha nombrando tres cosas que el sistema no hara este semestre; ese bloque evita que el alcance crezca sin control clase a clase.</w:t>
       </w:r>
     </w:p>
     <w:p>
@@ -328,7 +419,7 @@
           <w:color w:val="4A4A49"/>
           <w:sz w:val="22"/>
         </w:rPr>
-        <w:t>[Slide 8] La ficha de dominio de 6 bloques (2/2)</w:t>
+        <w:t>[Slide 5] Qué es arquitectura cloud (mapa mental)</w:t>
       </w:r>
       <w:r>
         <w:rPr>
@@ -336,25 +427,176 @@
           <w:color w:val="4A4A49"/>
           <w:sz w:val="22"/>
         </w:rPr>
-        <w:t xml:space="preserve"> — 2 vinetas.</w:t>
+        <w:t xml:space="preserve"> — 6 vinetas.</w:t>
       </w:r>
     </w:p>
     <w:p>
-      <w:r>
-        <w:rPr>
-          <w:b/>
-          <w:color w:val="4A4A49"/>
-          <w:sz w:val="22"/>
-        </w:rPr>
-        <w:t>[Slide 9] Que es arquitectura cloud (mapa mental) (1/3)</w:t>
-      </w:r>
+      <w:pPr>
+        <w:pStyle w:val="ListBullet2"/>
+      </w:pPr>
       <w:r>
         <w:rPr>
           <w:b w:val="0"/>
           <w:color w:val="4A4A49"/>
           <w:sz w:val="22"/>
         </w:rPr>
-        <w:t xml:space="preserve"> — 5 vinetas.</w:t>
+        <w:t>DESARROLLO (para explicarlo, no se proyecta):</w:t>
+      </w:r>
+    </w:p>
+    <w:p>
+      <w:pPr>
+        <w:pStyle w:val="ListBullet2"/>
+      </w:pPr>
+      <w:r>
+        <w:rPr>
+          <w:b w:val="0"/>
+          <w:color w:val="4A4A49"/>
+          <w:sz w:val="22"/>
+        </w:rPr>
+        <w:t>Arquitectura de software es el conjunto de decisiones estructurales que resultan costosas o imposibles de cambiar despues: como se dividen los componentes</w:t>
+      </w:r>
+    </w:p>
+    <w:p>
+      <w:pPr>
+        <w:pStyle w:val="ListBullet2"/>
+      </w:pPr>
+      <w:r>
+        <w:rPr>
+          <w:b w:val="0"/>
+          <w:color w:val="4A4A49"/>
+          <w:sz w:val="22"/>
+        </w:rPr>
+        <w:t>Como se comunican, donde se despliegan y que atributos de calidad se priorizan cuando entran en conflicto.</w:t>
+      </w:r>
+    </w:p>
+    <w:p>
+      <w:pPr>
+        <w:pStyle w:val="ListBullet2"/>
+      </w:pPr>
+      <w:r>
+        <w:rPr>
+          <w:b w:val="0"/>
+          <w:color w:val="4A4A49"/>
+          <w:sz w:val="22"/>
+        </w:rPr>
+        <w:t>La prueba practica para saber si una decision es arquitectonica consiste en preguntar cuanto costaria revertirla en tres meses.</w:t>
+      </w:r>
+    </w:p>
+    <w:p>
+      <w:pPr>
+        <w:pStyle w:val="ListBullet2"/>
+      </w:pPr>
+      <w:r>
+        <w:rPr>
+          <w:b w:val="0"/>
+          <w:color w:val="4A4A49"/>
+          <w:sz w:val="22"/>
+        </w:rPr>
+        <w:t>Cambiar el color de un boton no es arquitectura; cambiar de base de datos relacional a documental si lo es, porque arrastra el modelo de datos, las consultas, el codigo de acceso y las pruebas.</w:t>
+      </w:r>
+    </w:p>
+    <w:p>
+      <w:pPr>
+        <w:pStyle w:val="ListBullet2"/>
+      </w:pPr>
+      <w:r>
+        <w:rPr>
+          <w:b w:val="0"/>
+          <w:color w:val="4A4A49"/>
+          <w:sz w:val="22"/>
+        </w:rPr>
+        <w:t>El stack es la lista de tecnologias concretas; la arquitectura es la estructura y las razones.</w:t>
+      </w:r>
+    </w:p>
+    <w:p>
+      <w:pPr>
+        <w:pStyle w:val="ListBullet2"/>
+      </w:pPr>
+      <w:r>
+        <w:rPr>
+          <w:b w:val="0"/>
+          <w:color w:val="4A4A49"/>
+          <w:sz w:val="22"/>
+        </w:rPr>
+        <w:t>Dos proyectos pueden usar el mismo stack y tener arquitecturas opuestas: uno con un solo proceso que hace todo, otro con tres servicios que se comunican por red.</w:t>
+      </w:r>
+    </w:p>
+    <w:p>
+      <w:pPr>
+        <w:pStyle w:val="ListBullet2"/>
+      </w:pPr>
+      <w:r>
+        <w:rPr>
+          <w:b w:val="0"/>
+          <w:color w:val="4A4A49"/>
+          <w:sz w:val="22"/>
+        </w:rPr>
+        <w:t>Los atributos de calidad son las propiedades medibles que el sistema debe exhibir, y son el vocabulario con el que se justifica cualquier decision.</w:t>
+      </w:r>
+    </w:p>
+    <w:p>
+      <w:pPr>
+        <w:pStyle w:val="ListBullet2"/>
+      </w:pPr>
+      <w:r>
+        <w:rPr>
+          <w:b w:val="0"/>
+          <w:color w:val="4A4A49"/>
+          <w:sz w:val="22"/>
+        </w:rPr>
+        <w:t>Los cuatro que este curso usa de forma permanente son rendimiento, disponibilidad, seguridad y costo.</w:t>
+      </w:r>
+    </w:p>
+    <w:p>
+      <w:pPr>
+        <w:pStyle w:val="ListBullet2"/>
+      </w:pPr>
+      <w:r>
+        <w:rPr>
+          <w:b w:val="0"/>
+          <w:color w:val="4A4A49"/>
+          <w:sz w:val="22"/>
+        </w:rPr>
+        <w:t>Disponibilidad se expresa como porcentaje de tiempo en que el sistema responde, y ahi el numero si es aritmetica exacta: 99 % permite unas 7 horas de caida al mes, 99,9 % (los llamados tres nueves) alrededor de 43 minutos, y 99,99 % poco mas de 4 minutos.</w:t>
+      </w:r>
+    </w:p>
+    <w:p>
+      <w:pPr>
+        <w:pStyle w:val="ListBullet2"/>
+      </w:pPr>
+      <w:r>
+        <w:rPr>
+          <w:b w:val="0"/>
+          <w:color w:val="4A4A49"/>
+          <w:sz w:val="22"/>
+        </w:rPr>
+        <w:t>El punto central es que estos atributos compiten entre si: mas disponibilidad exige redundancia, la redundancia cuesta dinero, y por eso la arquitectura es sobre todo el oficio de elegir que se sacrifica.</w:t>
+      </w:r>
+    </w:p>
+    <w:p>
+      <w:pPr>
+        <w:pStyle w:val="ListBullet2"/>
+      </w:pPr>
+      <w:r>
+        <w:rPr>
+          <w:b w:val="0"/>
+          <w:color w:val="4A4A49"/>
+          <w:sz w:val="22"/>
+        </w:rPr>
+        <w:t>El cambio economico que esto produce es lo relevante para la arquitectura, porque la infraestructura deja de ser una compra que se hace por adelantado y se amortiza a largo plazo, y pasa a ser un gasto operativo que cambia con cada decision de diseno.</w:t>
+      </w:r>
+    </w:p>
+    <w:p>
+      <w:pPr>
+        <w:pStyle w:val="ListBullet2"/>
+      </w:pPr>
+      <w:r>
+        <w:rPr>
+          <w:b w:val="0"/>
+          <w:color w:val="4A4A49"/>
+          <w:sz w:val="22"/>
+        </w:rPr>
+        <w:t>NOTAS:</w:t>
       </w:r>
     </w:p>
     <w:p>
@@ -494,7 +736,612 @@
           <w:color w:val="4A4A49"/>
           <w:sz w:val="22"/>
         </w:rPr>
-        <w:t>[Slide 10] Que es arquitectura cloud (mapa mental) (2/3)</w:t>
+        <w:t>[Slide 6] CloudLite App — el hilo conductor</w:t>
+      </w:r>
+      <w:r>
+        <w:rPr>
+          <w:b w:val="0"/>
+          <w:color w:val="4A4A49"/>
+          <w:sz w:val="22"/>
+        </w:rPr>
+        <w:t xml:space="preserve"> — 6 vinetas.</w:t>
+      </w:r>
+    </w:p>
+    <w:p>
+      <w:pPr>
+        <w:pStyle w:val="ListBullet2"/>
+      </w:pPr>
+      <w:r>
+        <w:rPr>
+          <w:b w:val="0"/>
+          <w:color w:val="4A4A49"/>
+          <w:sz w:val="22"/>
+        </w:rPr>
+        <w:t>DESARROLLO (para explicarlo, no se proyecta):</w:t>
+      </w:r>
+    </w:p>
+    <w:p>
+      <w:pPr>
+        <w:pStyle w:val="ListBullet2"/>
+      </w:pPr>
+      <w:r>
+        <w:rPr>
+          <w:b w:val="0"/>
+          <w:color w:val="4A4A49"/>
+          <w:sz w:val="22"/>
+        </w:rPr>
+        <w:t>El diagrama de contexto correcto tiene una sola caja llamada CloudLite Turnos, tres actores alrededor (el cliente que reserva</w:t>
+      </w:r>
+    </w:p>
+    <w:p>
+      <w:pPr>
+        <w:pStyle w:val="ListBullet2"/>
+      </w:pPr>
+      <w:r>
+        <w:rPr>
+          <w:b w:val="0"/>
+          <w:color w:val="4A4A49"/>
+          <w:sz w:val="22"/>
+        </w:rPr>
+        <w:t>El barbero que consulta su agenda del dia y el administrador que configura horarios y precios) y dos o tres sistemas externos con la flecha etiquetada: una pasarela de pagos</w:t>
+      </w:r>
+    </w:p>
+    <w:p>
+      <w:pPr>
+        <w:pStyle w:val="ListBullet2"/>
+      </w:pPr>
+      <w:r>
+        <w:rPr>
+          <w:b w:val="0"/>
+          <w:color w:val="4A4A49"/>
+          <w:sz w:val="22"/>
+        </w:rPr>
+        <w:t>Con la etiqueta «envia solicitud de cobro y recibe confirmacion»; un proveedor de correo, con la etiqueta «envia recordatorio de turno»; y quizas un servicio de mapas.</w:t>
+      </w:r>
+    </w:p>
+    <w:p>
+      <w:pPr>
+        <w:pStyle w:val="ListBullet2"/>
+      </w:pPr>
+      <w:r>
+        <w:rPr>
+          <w:b w:val="0"/>
+          <w:color w:val="4A4A49"/>
+          <w:sz w:val="22"/>
+        </w:rPr>
+        <w:t>Nada mas: la API, la base de datos y el almacenamiento de fotos no aparecen todavia porque son interiores.</w:t>
+      </w:r>
+    </w:p>
+    <w:p>
+      <w:pPr>
+        <w:pStyle w:val="ListBullet2"/>
+      </w:pPr>
+      <w:r>
+        <w:rPr>
+          <w:b w:val="0"/>
+          <w:color w:val="4A4A49"/>
+          <w:sz w:val="22"/>
+        </w:rPr>
+        <w:t>Un sistema que depende de una pasarela de pagos hereda su disponibilidad, y esa herencia es una decision arquitectonica aunque nadie la haya escrito.</w:t>
+      </w:r>
+    </w:p>
+    <w:p>
+      <w:pPr>
+        <w:pStyle w:val="ListBullet2"/>
+      </w:pPr>
+      <w:r>
+        <w:rPr>
+          <w:b w:val="0"/>
+          <w:color w:val="4A4A49"/>
+          <w:sz w:val="22"/>
+        </w:rPr>
+        <w:t>NOTAS:</w:t>
+      </w:r>
+    </w:p>
+    <w:p>
+      <w:pPr>
+        <w:pStyle w:val="ListBullet2"/>
+      </w:pPr>
+      <w:r>
+        <w:rPr>
+          <w:b w:val="0"/>
+          <w:color w:val="4A4A49"/>
+          <w:sz w:val="22"/>
+        </w:rPr>
+        <w:t>Aterricemos en CloudLite App, el proyecto integrador que atraviesa las quince clases.</w:t>
+      </w:r>
+    </w:p>
+    <w:p>
+      <w:pPr>
+        <w:pStyle w:val="ListBullet2"/>
+      </w:pPr>
+      <w:r>
+        <w:rPr>
+          <w:b w:val="0"/>
+          <w:color w:val="4A4A49"/>
+          <w:sz w:val="22"/>
+        </w:rPr>
+        <w:t>Supongamos que un estudiante elige como dominio la gestion de turnos de una barberia.</w:t>
+      </w:r>
+    </w:p>
+    <w:p>
+      <w:pPr>
+        <w:pStyle w:val="ListBullet2"/>
+      </w:pPr>
+      <w:r>
+        <w:rPr>
+          <w:b w:val="0"/>
+          <w:color w:val="4A4A49"/>
+          <w:sz w:val="22"/>
+        </w:rPr>
+        <w:t>(No se proyecta) El valor de ese diagrama de cinco o seis elementos esta en que obliga a responder dos preguntas que el estudiante no se habia hecho: quien exactamente usa esto y de que terceros depende para funcionar.</w:t>
+      </w:r>
+    </w:p>
+    <w:p>
+      <w:r>
+        <w:rPr>
+          <w:b/>
+          <w:color w:val="4A4A49"/>
+          <w:sz w:val="22"/>
+        </w:rPr>
+        <w:t>[Slide 7] De dominio a arquitectura (mini-método)</w:t>
+      </w:r>
+      <w:r>
+        <w:rPr>
+          <w:b w:val="0"/>
+          <w:color w:val="4A4A49"/>
+          <w:sz w:val="22"/>
+        </w:rPr>
+        <w:t xml:space="preserve"> — 6 vinetas.</w:t>
+      </w:r>
+    </w:p>
+    <w:p>
+      <w:pPr>
+        <w:pStyle w:val="ListBullet2"/>
+      </w:pPr>
+      <w:r>
+        <w:rPr>
+          <w:b w:val="0"/>
+          <w:color w:val="4A4A49"/>
+          <w:sz w:val="22"/>
+        </w:rPr>
+        <w:t>DESARROLLO (para explicarlo, no se proyecta):</w:t>
+      </w:r>
+    </w:p>
+    <w:p>
+      <w:pPr>
+        <w:pStyle w:val="ListBullet2"/>
+      </w:pPr>
+      <w:r>
+        <w:rPr>
+          <w:b w:val="0"/>
+          <w:color w:val="4A4A49"/>
+          <w:sz w:val="22"/>
+        </w:rPr>
+        <w:t>El modelo C4 es la notacion que este curso usa para dibujar arquitectura, y su virtud es ofrecer cuatro niveles de zoom con reglas claras sobre que se muestra en cada uno, en lugar de un unico diagrama que mezcla todo.</w:t>
+      </w:r>
+    </w:p>
+    <w:p>
+      <w:pPr>
+        <w:pStyle w:val="ListBullet2"/>
+      </w:pPr>
+      <w:r>
+        <w:rPr>
+          <w:b w:val="0"/>
+          <w:color w:val="4A4A49"/>
+          <w:sz w:val="22"/>
+        </w:rPr>
+        <w:t>Nivel 1, Contexto: el sistema es una sola caja negra y alrededor aparecen unicamente las personas que lo usan y los sistemas externos con los que intercambia informacion.</w:t>
+      </w:r>
+    </w:p>
+    <w:p>
+      <w:pPr>
+        <w:pStyle w:val="ListBullet2"/>
+      </w:pPr>
+      <w:r>
+        <w:rPr>
+          <w:b w:val="0"/>
+          <w:color w:val="4A4A49"/>
+          <w:sz w:val="22"/>
+        </w:rPr>
+        <w:t>Nivel 2, Contenedores: se abre esa caja y se ven las aplicaciones, servicios y bases de datos que la componen.</w:t>
+      </w:r>
+    </w:p>
+    <w:p>
+      <w:pPr>
+        <w:pStyle w:val="ListBullet2"/>
+      </w:pPr>
+      <w:r>
+        <w:rPr>
+          <w:b w:val="0"/>
+          <w:color w:val="4A4A49"/>
+          <w:sz w:val="22"/>
+        </w:rPr>
+        <w:t>Nivel 3, Componentes: se abre un contenedor y se ven sus modulos internos.</w:t>
+      </w:r>
+    </w:p>
+    <w:p>
+      <w:pPr>
+        <w:pStyle w:val="ListBullet2"/>
+      </w:pPr>
+      <w:r>
+        <w:rPr>
+          <w:b w:val="0"/>
+          <w:color w:val="4A4A49"/>
+          <w:sz w:val="22"/>
+        </w:rPr>
+        <w:t>Nivel 4, Codigo: clases y funciones, que en la practica casi nunca se dibuja porque el codigo mismo ya lo documenta.</w:t>
+      </w:r>
+    </w:p>
+    <w:p>
+      <w:pPr>
+        <w:pStyle w:val="ListBullet2"/>
+      </w:pPr>
+      <w:r>
+        <w:rPr>
+          <w:b w:val="0"/>
+          <w:color w:val="4A4A49"/>
+          <w:sz w:val="22"/>
+        </w:rPr>
+        <w:t>El segundo artefacto de hoy es la ficha con cuatro capacidades y el problema en tres frases.</w:t>
+      </w:r>
+    </w:p>
+    <w:p>
+      <w:pPr>
+        <w:pStyle w:val="ListBullet2"/>
+      </w:pPr>
+      <w:r>
+        <w:rPr>
+          <w:b w:val="0"/>
+          <w:color w:val="4A4A49"/>
+          <w:sz w:val="22"/>
+        </w:rPr>
+        <w:t>Una capacidad se escribe como un verbo de negocio que el usuario puede ejecutar, no como una pieza tecnica: «reservar un turno disponible», «cancelar o reprogramar hasta dos horas antes», «consultar la agenda del dia» y «cobrar un anticipo» son capacidades</w:t>
+      </w:r>
+    </w:p>
+    <w:p>
+      <w:pPr>
+        <w:pStyle w:val="ListBullet2"/>
+      </w:pPr>
+      <w:r>
+        <w:rPr>
+          <w:b w:val="0"/>
+          <w:color w:val="4A4A49"/>
+          <w:sz w:val="22"/>
+        </w:rPr>
+        <w:t>«tener login con JWT», «usar cache» o «tener panel administrativo» no lo son, porque son medios y no fines.</w:t>
+      </w:r>
+    </w:p>
+    <w:p>
+      <w:pPr>
+        <w:pStyle w:val="ListBullet2"/>
+      </w:pPr>
+      <w:r>
+        <w:rPr>
+          <w:b w:val="0"/>
+          <w:color w:val="4A4A49"/>
+          <w:sz w:val="22"/>
+        </w:rPr>
+        <w:t>El limite de cuatro capacidades es una decision pedagogica deliberada y no una regla de la industria: con cada estudiante trabajando de forma individual durante doce semanas, un alcance de ocho capacidades garantiza que el proyecto no llegue a ninguna parte.</w:t>
+      </w:r>
+    </w:p>
+    <w:p>
+      <w:pPr>
+        <w:pStyle w:val="ListBullet2"/>
+      </w:pPr>
+      <w:r>
+        <w:rPr>
+          <w:b w:val="0"/>
+          <w:color w:val="4A4A49"/>
+          <w:sz w:val="22"/>
+        </w:rPr>
+        <w:t>El enunciado del problema debe nombrar a quien le duele y que pierde hoy, con alguna cifra aunque sea estimada: «la barberia agenda por mensajeria instantanea</w:t>
+      </w:r>
+    </w:p>
+    <w:p>
+      <w:pPr>
+        <w:pStyle w:val="ListBullet2"/>
+      </w:pPr>
+      <w:r>
+        <w:rPr>
+          <w:b w:val="0"/>
+          <w:color w:val="4A4A49"/>
+          <w:sz w:val="22"/>
+        </w:rPr>
+        <w:t>Pierde alrededor de tres turnos diarios por doble reserva y no tiene registro de cuantos clientes no se presentaron».</w:t>
+      </w:r>
+    </w:p>
+    <w:p>
+      <w:pPr>
+        <w:pStyle w:val="ListBullet2"/>
+      </w:pPr>
+      <w:r>
+        <w:rPr>
+          <w:b w:val="0"/>
+          <w:color w:val="4A4A49"/>
+          <w:sz w:val="22"/>
+        </w:rPr>
+        <w:t>NOTAS:</w:t>
+      </w:r>
+    </w:p>
+    <w:p>
+      <w:pPr>
+        <w:pStyle w:val="ListBullet2"/>
+      </w:pPr>
+      <w:r>
+        <w:rPr>
+          <w:b w:val="0"/>
+          <w:color w:val="4A4A49"/>
+          <w:sz w:val="22"/>
+        </w:rPr>
+        <w:t>Un problema sin afectado concreto y sin magnitud produce arquitecturas que nadie puede evaluar, porque no hay contra que comparar.</w:t>
+      </w:r>
+    </w:p>
+    <w:p>
+      <w:pPr>
+        <w:pStyle w:val="ListBullet2"/>
+      </w:pPr>
+      <w:r>
+        <w:rPr>
+          <w:b w:val="0"/>
+          <w:color w:val="4A4A49"/>
+          <w:sz w:val="22"/>
+        </w:rPr>
+        <w:t>(No se proyecta) Hoy se trabaja unicamente el nivel 1, y la regla es estricta: si en el diagrama de contexto aparecen las palabras PostgreSQL, Docker o Redis, el diagrama esta mal, porque eso es interior del sistema y corresponde al nivel 2 de la Clase 4.</w:t>
+      </w:r>
+    </w:p>
+    <w:p>
+      <w:r>
+        <w:rPr>
+          <w:b/>
+          <w:color w:val="4A4A49"/>
+          <w:sz w:val="22"/>
+        </w:rPr>
+        <w:t>[Slide 8] Ejemplo de diagrama C4 - nivel Context</w:t>
+      </w:r>
+      <w:r>
+        <w:rPr>
+          <w:b w:val="0"/>
+          <w:color w:val="4A4A49"/>
+          <w:sz w:val="22"/>
+        </w:rPr>
+        <w:t xml:space="preserve"> — 3 vinetas.</w:t>
+      </w:r>
+    </w:p>
+    <w:p>
+      <w:pPr>
+        <w:pStyle w:val="ListBullet2"/>
+      </w:pPr>
+      <w:r>
+        <w:rPr>
+          <w:b w:val="0"/>
+          <w:color w:val="4A4A49"/>
+          <w:sz w:val="22"/>
+        </w:rPr>
+        <w:t>DESARROLLO (para explicarlo, no se proyecta):</w:t>
+      </w:r>
+    </w:p>
+    <w:p>
+      <w:pPr>
+        <w:pStyle w:val="ListBullet2"/>
+      </w:pPr>
+      <w:r>
+        <w:rPr>
+          <w:b w:val="0"/>
+          <w:color w:val="4A4A49"/>
+          <w:sz w:val="22"/>
+        </w:rPr>
+        <w:t>Un diagrama de contexto tiene tres tipos de elemento: Person, System y System_Ext.</w:t>
+      </w:r>
+    </w:p>
+    <w:p>
+      <w:pPr>
+        <w:pStyle w:val="ListBullet2"/>
+      </w:pPr>
+      <w:r>
+        <w:rPr>
+          <w:b w:val="0"/>
+          <w:color w:val="4A4A49"/>
+          <w:sz w:val="22"/>
+        </w:rPr>
+        <w:t>Cada flecha lleva un verbo de negocio, por ejemplo «Cliente reserva turno en CloudLite Turnos» o «CloudLite Turnos envia recordatorio por el proveedor de correo».</w:t>
+      </w:r>
+    </w:p>
+    <w:p>
+      <w:pPr>
+        <w:pStyle w:val="ListBullet2"/>
+      </w:pPr>
+      <w:r>
+        <w:rPr>
+          <w:b w:val="0"/>
+          <w:color w:val="4A4A49"/>
+          <w:sz w:val="22"/>
+        </w:rPr>
+        <w:t>El error mas comun es dibujar la base de datos o la API en este nivel: son piezas internas y pertenecen al nivel 2, Containers.</w:t>
+      </w:r>
+    </w:p>
+    <w:p>
+      <w:pPr>
+        <w:pStyle w:val="ListBullet2"/>
+      </w:pPr>
+      <w:r>
+        <w:rPr>
+          <w:b w:val="0"/>
+          <w:color w:val="4A4A49"/>
+          <w:sz w:val="22"/>
+        </w:rPr>
+        <w:t>Un Context legible tiene entre 4 y 8 elementos; si tiene mas, la caja del sistema ya se esta abriendo.</w:t>
+      </w:r>
+    </w:p>
+    <w:p>
+      <w:pPr>
+        <w:pStyle w:val="ListBullet2"/>
+      </w:pPr>
+      <w:r>
+        <w:rPr>
+          <w:b w:val="0"/>
+          <w:color w:val="4A4A49"/>
+          <w:sz w:val="22"/>
+        </w:rPr>
+        <w:t>NOTAS:</w:t>
+      </w:r>
+    </w:p>
+    <w:p>
+      <w:pPr>
+        <w:pStyle w:val="ListBullet2"/>
+      </w:pPr>
+      <w:r>
+        <w:rPr>
+          <w:b w:val="0"/>
+          <w:color w:val="4A4A49"/>
+          <w:sz w:val="22"/>
+        </w:rPr>
+        <w:t>En el diagrama proyectado (System, dos Person, System_Ext) el nivel Context muestra el sistema como UNA sola caja, sin abrir por dentro.</w:t>
+      </w:r>
+    </w:p>
+    <w:p>
+      <w:pPr>
+        <w:pStyle w:val="ListBullet2"/>
+      </w:pPr>
+      <w:r>
+        <w:rPr>
+          <w:b w:val="0"/>
+          <w:color w:val="4A4A49"/>
+          <w:sz w:val="22"/>
+        </w:rPr>
+        <w:t>PREGUNTAS FRECUENTES Y CIERRE CONCEPTUAL ()</w:t>
+      </w:r>
+    </w:p>
+    <w:p>
+      <w:pPr>
+        <w:pStyle w:val="ListBullet2"/>
+      </w:pPr>
+      <w:r>
+        <w:rPr>
+          <w:b w:val="0"/>
+          <w:color w:val="4A4A49"/>
+          <w:sz w:val="22"/>
+        </w:rPr>
+        <w:t>Respuesta: es una diferencia de alcance y de reversibilidad, no de naturaleza</w:t>
+      </w:r>
+    </w:p>
+    <w:p>
+      <w:pPr>
+        <w:pStyle w:val="ListBullet2"/>
+      </w:pPr>
+      <w:r>
+        <w:rPr>
+          <w:b w:val="0"/>
+          <w:color w:val="4A4A49"/>
+          <w:sz w:val="22"/>
+        </w:rPr>
+        <w:t>Arquitectura son las decisiones que afectan a todo el sistema y son caras de revertir, diseno son las decisiones internas de un componente que se pueden cambiar sin tocar a los demas.</w:t>
+      </w:r>
+    </w:p>
+    <w:p>
+      <w:pPr>
+        <w:pStyle w:val="ListBullet2"/>
+      </w:pPr>
+      <w:r>
+        <w:rPr>
+          <w:b w:val="0"/>
+          <w:color w:val="4A4A49"/>
+          <w:sz w:val="22"/>
+        </w:rPr>
+        <w:t>La segunda: por que no usamos una cuenta real de un proveedor de nube.</w:t>
+      </w:r>
+    </w:p>
+    <w:p>
+      <w:pPr>
+        <w:pStyle w:val="ListBullet2"/>
+      </w:pPr>
+      <w:r>
+        <w:rPr>
+          <w:b w:val="0"/>
+          <w:color w:val="4A4A49"/>
+          <w:sz w:val="22"/>
+        </w:rPr>
+        <w:t>La tercera: cuantas cajas debe tener mi diagrama.</w:t>
+      </w:r>
+    </w:p>
+    <w:p>
+      <w:pPr>
+        <w:pStyle w:val="ListBullet2"/>
+      </w:pPr>
+      <w:r>
+        <w:rPr>
+          <w:b w:val="0"/>
+          <w:color w:val="4A4A49"/>
+          <w:sz w:val="22"/>
+        </w:rPr>
+        <w:t>Respuesta: en el nivel de contexto, entre cuatro y ocho elementos en total; si hay veinte, es casi seguro que se colaron piezas internas.</w:t>
+      </w:r>
+    </w:p>
+    <w:p>
+      <w:pPr>
+        <w:pStyle w:val="ListBullet2"/>
+      </w:pPr>
+      <w:r>
+        <w:rPr>
+          <w:b w:val="0"/>
+          <w:color w:val="4A4A49"/>
+          <w:sz w:val="22"/>
+        </w:rPr>
+        <w:t>La primera: cual es la diferencia entre arquitectura y diseno.</w:t>
+      </w:r>
+    </w:p>
+    <w:p>
+      <w:pPr>
+        <w:pStyle w:val="ListBullet2"/>
+      </w:pPr>
+      <w:r>
+        <w:rPr>
+          <w:b w:val="0"/>
+          <w:color w:val="4A4A49"/>
+          <w:sz w:val="22"/>
+        </w:rPr>
+        <w:t>Respuesta, y hay que darla sin disculparse: porque este curso evalua razonamiento arquitectonico y no el manejo de una consola que cambia de aspecto cada semestre; ninguna actividad exigira tarjeta de credito ni cuenta de pago, todo se hace con draw.io, Excalidraw, Killercoda y el nivel gratuito de GitHub Actions, y quien aprende a justificar un trade-off lo aplica luego en cualquier proveedor en una tarde.</w:t>
+      </w:r>
+    </w:p>
+    <w:p>
+      <w:pPr>
+        <w:pStyle w:val="ListBullet2"/>
+      </w:pPr>
+      <w:r>
+        <w:rPr>
+          <w:b w:val="0"/>
+          <w:color w:val="4A4A49"/>
+          <w:sz w:val="22"/>
+        </w:rPr>
+        <w:t>(No se proyecta) Es el mismo modelo C4 explicado arriba, ahora aplicado con nombres concretos, y sirve de puente directo hacia la pregunta 2 del taller en la plataforma del curso (el diagrama Mermaid que cada estudiante entrega hoy).</w:t>
+      </w:r>
+    </w:p>
+    <w:p>
+      <w:r>
+        <w:rPr>
+          <w:b/>
+          <w:color w:val="4A4A49"/>
+          <w:sz w:val="22"/>
+        </w:rPr>
+        <w:t>[Slide 9] El C4 Context en Mermaid: el sistema es una sola caja</w:t>
+      </w:r>
+      <w:r>
+        <w:rPr>
+          <w:b w:val="0"/>
+          <w:color w:val="4A4A49"/>
+          <w:sz w:val="22"/>
+        </w:rPr>
+        <w:t xml:space="preserve"> — 12 vinetas.</w:t>
+      </w:r>
+    </w:p>
+    <w:p>
+      <w:r>
+        <w:rPr>
+          <w:b/>
+          <w:color w:val="4A4A49"/>
+          <w:sz w:val="22"/>
+        </w:rPr>
+        <w:t>[Slide 10] Ejemplo de diagrama C4 — nivel Context</w:t>
       </w:r>
       <w:r>
         <w:rPr>
@@ -503,254 +1350,6 @@
           <w:sz w:val="22"/>
         </w:rPr>
         <w:t xml:space="preserve"> — 4 vinetas.</w:t>
-      </w:r>
-    </w:p>
-    <w:p>
-      <w:r>
-        <w:rPr>
-          <w:b/>
-          <w:color w:val="4A4A49"/>
-          <w:sz w:val="22"/>
-        </w:rPr>
-        <w:t>[Slide 11] Que es arquitectura cloud (mapa mental) (3/3)</w:t>
-      </w:r>
-      <w:r>
-        <w:rPr>
-          <w:b w:val="0"/>
-          <w:color w:val="4A4A49"/>
-          <w:sz w:val="22"/>
-        </w:rPr>
-        <w:t xml:space="preserve"> — 2 vinetas.</w:t>
-      </w:r>
-    </w:p>
-    <w:p>
-      <w:r>
-        <w:rPr>
-          <w:b/>
-          <w:color w:val="4A4A49"/>
-          <w:sz w:val="22"/>
-        </w:rPr>
-        <w:t>[Slide 12] CloudLite App - el hilo conductor</w:t>
-      </w:r>
-      <w:r>
-        <w:rPr>
-          <w:b w:val="0"/>
-          <w:color w:val="4A4A49"/>
-          <w:sz w:val="22"/>
-        </w:rPr>
-        <w:t xml:space="preserve"> — 5 vinetas.</w:t>
-      </w:r>
-    </w:p>
-    <w:p>
-      <w:pPr>
-        <w:pStyle w:val="ListBullet2"/>
-      </w:pPr>
-      <w:r>
-        <w:rPr>
-          <w:b w:val="0"/>
-          <w:color w:val="4A4A49"/>
-          <w:sz w:val="22"/>
-        </w:rPr>
-        <w:t>Aterricemos en CloudLite App, el proyecto integrador que atraviesa las quince clases.</w:t>
-      </w:r>
-    </w:p>
-    <w:p>
-      <w:pPr>
-        <w:pStyle w:val="ListBullet2"/>
-      </w:pPr>
-      <w:r>
-        <w:rPr>
-          <w:b w:val="0"/>
-          <w:color w:val="4A4A49"/>
-          <w:sz w:val="22"/>
-        </w:rPr>
-        <w:t>Supongamos que un estudiante elige como dominio la gestion de turnos de una barberia.</w:t>
-      </w:r>
-    </w:p>
-    <w:p>
-      <w:pPr>
-        <w:pStyle w:val="ListBullet2"/>
-      </w:pPr>
-      <w:r>
-        <w:rPr>
-          <w:b w:val="0"/>
-          <w:color w:val="4A4A49"/>
-          <w:sz w:val="22"/>
-        </w:rPr>
-        <w:t>(No se proyecta) El valor de ese diagrama de cinco o seis elementos esta en que obliga a responder dos preguntas que el estudiante no se habia hecho: quien exactamente usa esto y de que terceros depende para funcionar.</w:t>
-      </w:r>
-    </w:p>
-    <w:p>
-      <w:r>
-        <w:rPr>
-          <w:b/>
-          <w:color w:val="4A4A49"/>
-          <w:sz w:val="22"/>
-        </w:rPr>
-        <w:t>[Slide 13] De dominio a arquitectura (mini-metodo) (1/3)</w:t>
-      </w:r>
-      <w:r>
-        <w:rPr>
-          <w:b w:val="0"/>
-          <w:color w:val="4A4A49"/>
-          <w:sz w:val="22"/>
-        </w:rPr>
-        <w:t xml:space="preserve"> — 4 vinetas.</w:t>
-      </w:r>
-    </w:p>
-    <w:p>
-      <w:pPr>
-        <w:pStyle w:val="ListBullet2"/>
-      </w:pPr>
-      <w:r>
-        <w:rPr>
-          <w:b w:val="0"/>
-          <w:color w:val="4A4A49"/>
-          <w:sz w:val="22"/>
-        </w:rPr>
-        <w:t>Un problema sin afectado concreto y sin magnitud produce arquitecturas que nadie puede evaluar, porque no hay contra que comparar.</w:t>
-      </w:r>
-    </w:p>
-    <w:p>
-      <w:pPr>
-        <w:pStyle w:val="ListBullet2"/>
-      </w:pPr>
-      <w:r>
-        <w:rPr>
-          <w:b w:val="0"/>
-          <w:color w:val="4A4A49"/>
-          <w:sz w:val="22"/>
-        </w:rPr>
-        <w:t>(No se proyecta) Hoy se trabaja unicamente el nivel 1, y la regla es estricta: si en el diagrama de contexto aparecen las palabras PostgreSQL, Docker o Redis, el diagrama esta mal, porque eso es interior del sistema y corresponde al nivel 2 de la Clase 4.</w:t>
-      </w:r>
-    </w:p>
-    <w:p>
-      <w:r>
-        <w:rPr>
-          <w:b/>
-          <w:color w:val="4A4A49"/>
-          <w:sz w:val="22"/>
-        </w:rPr>
-        <w:t>[Slide 14] De dominio a arquitectura (mini-metodo) (2/3)</w:t>
-      </w:r>
-      <w:r>
-        <w:rPr>
-          <w:b w:val="0"/>
-          <w:color w:val="4A4A49"/>
-          <w:sz w:val="22"/>
-        </w:rPr>
-        <w:t xml:space="preserve"> — 4 vinetas.</w:t>
-      </w:r>
-    </w:p>
-    <w:p>
-      <w:r>
-        <w:rPr>
-          <w:b/>
-          <w:color w:val="4A4A49"/>
-          <w:sz w:val="22"/>
-        </w:rPr>
-        <w:t>[Slide 15] De dominio a arquitectura (mini-metodo) (3/3)</w:t>
-      </w:r>
-      <w:r>
-        <w:rPr>
-          <w:b w:val="0"/>
-          <w:color w:val="4A4A49"/>
-          <w:sz w:val="22"/>
-        </w:rPr>
-        <w:t xml:space="preserve"> — 3 vinetas.</w:t>
-      </w:r>
-    </w:p>
-    <w:p>
-      <w:r>
-        <w:rPr>
-          <w:b/>
-          <w:color w:val="4A4A49"/>
-          <w:sz w:val="22"/>
-        </w:rPr>
-        <w:t>[Slide 16] Ejemplo de diagrama C4 - nivel Context</w:t>
-      </w:r>
-      <w:r>
-        <w:rPr>
-          <w:b w:val="0"/>
-          <w:color w:val="4A4A49"/>
-          <w:sz w:val="22"/>
-        </w:rPr>
-        <w:t xml:space="preserve"> — 4 vinetas.</w:t>
-      </w:r>
-    </w:p>
-    <w:p>
-      <w:pPr>
-        <w:pStyle w:val="ListBullet2"/>
-      </w:pPr>
-      <w:r>
-        <w:rPr>
-          <w:b w:val="0"/>
-          <w:color w:val="4A4A49"/>
-          <w:sz w:val="22"/>
-        </w:rPr>
-        <w:t>En el diagrama proyectado (System, dos Person, System_Ext) el nivel Context muestra el sistema como UNA sola caja, sin abrir por dentro.</w:t>
-      </w:r>
-    </w:p>
-    <w:p>
-      <w:pPr>
-        <w:pStyle w:val="ListBullet2"/>
-      </w:pPr>
-      <w:r>
-        <w:rPr>
-          <w:b w:val="0"/>
-          <w:color w:val="4A4A49"/>
-          <w:sz w:val="22"/>
-        </w:rPr>
-        <w:t>(No se proyecta) Es el mismo modelo C4 explicado arriba, ahora aplicado con nombres concretos, y sirve de puente directo hacia la pregunta 2 del taller en la plataforma del curso (el diagrama Mermaid que cada estudiante entrega hoy).</w:t>
-      </w:r>
-    </w:p>
-    <w:p>
-      <w:r>
-        <w:rPr>
-          <w:b/>
-          <w:color w:val="4A4A49"/>
-          <w:sz w:val="22"/>
-        </w:rPr>
-        <w:t>[Slide 17] Preguntas frecuentes y cierre conceptual (1/2)</w:t>
-      </w:r>
-      <w:r>
-        <w:rPr>
-          <w:b w:val="0"/>
-          <w:color w:val="4A4A49"/>
-          <w:sz w:val="22"/>
-        </w:rPr>
-        <w:t xml:space="preserve"> — 4 vinetas.</w:t>
-      </w:r>
-    </w:p>
-    <w:p>
-      <w:pPr>
-        <w:pStyle w:val="ListBullet2"/>
-      </w:pPr>
-      <w:r>
-        <w:rPr>
-          <w:b w:val="0"/>
-          <w:color w:val="4A4A49"/>
-          <w:sz w:val="22"/>
-        </w:rPr>
-        <w:t>La primera: cual es la diferencia entre arquitectura y diseno.</w:t>
-      </w:r>
-    </w:p>
-    <w:p>
-      <w:r>
-        <w:rPr>
-          <w:b/>
-          <w:color w:val="4A4A49"/>
-          <w:sz w:val="22"/>
-        </w:rPr>
-        <w:t>[Slide 18] Preguntas frecuentes y cierre conceptual (2/2)</w:t>
-      </w:r>
-      <w:r>
-        <w:rPr>
-          <w:b w:val="0"/>
-          <w:color w:val="4A4A49"/>
-          <w:sz w:val="22"/>
-        </w:rPr>
-        <w:t xml:space="preserve"> — 3 vinetas.</w:t>
       </w:r>
     </w:p>
     <w:p>
@@ -852,6 +1451,19 @@
           <w:color w:val="4A4A49"/>
           <w:sz w:val="22"/>
         </w:rPr>
+        <w:t>La ficha de dominio de 5 bloques</w:t>
+      </w:r>
+    </w:p>
+    <w:p>
+      <w:pPr>
+        <w:pStyle w:val="ListNumber"/>
+      </w:pPr>
+      <w:r>
+        <w:rPr>
+          <w:b w:val="0"/>
+          <w:color w:val="4A4A49"/>
+          <w:sz w:val="22"/>
+        </w:rPr>
         <w:t>Qué es arquitectura cloud (mapa mental)</w:t>
       </w:r>
     </w:p>
@@ -891,7 +1503,7 @@
           <w:color w:val="4A4A49"/>
           <w:sz w:val="22"/>
         </w:rPr>
-        <w:t>La ficha de dominio de 6 bloques (1/2)</w:t>
+        <w:t>Ejemplo de diagrama C4 - nivel Context</w:t>
       </w:r>
     </w:p>
     <w:p>
@@ -904,137 +1516,7 @@
           <w:color w:val="4A4A49"/>
           <w:sz w:val="22"/>
         </w:rPr>
-        <w:t>La ficha de dominio de 6 bloques (2/2)</w:t>
-      </w:r>
-    </w:p>
-    <w:p>
-      <w:pPr>
-        <w:pStyle w:val="ListNumber"/>
-      </w:pPr>
-      <w:r>
-        <w:rPr>
-          <w:b w:val="0"/>
-          <w:color w:val="4A4A49"/>
-          <w:sz w:val="22"/>
-        </w:rPr>
-        <w:t>Que es arquitectura cloud (mapa mental) (1/3)</w:t>
-      </w:r>
-    </w:p>
-    <w:p>
-      <w:pPr>
-        <w:pStyle w:val="ListNumber"/>
-      </w:pPr>
-      <w:r>
-        <w:rPr>
-          <w:b w:val="0"/>
-          <w:color w:val="4A4A49"/>
-          <w:sz w:val="22"/>
-        </w:rPr>
-        <w:t>Que es arquitectura cloud (mapa mental) (2/3)</w:t>
-      </w:r>
-    </w:p>
-    <w:p>
-      <w:pPr>
-        <w:pStyle w:val="ListNumber"/>
-      </w:pPr>
-      <w:r>
-        <w:rPr>
-          <w:b w:val="0"/>
-          <w:color w:val="4A4A49"/>
-          <w:sz w:val="22"/>
-        </w:rPr>
-        <w:t>Que es arquitectura cloud (mapa mental) (3/3)</w:t>
-      </w:r>
-    </w:p>
-    <w:p>
-      <w:pPr>
-        <w:pStyle w:val="ListNumber"/>
-      </w:pPr>
-      <w:r>
-        <w:rPr>
-          <w:b w:val="0"/>
-          <w:color w:val="4A4A49"/>
-          <w:sz w:val="22"/>
-        </w:rPr>
-        <w:t>CloudLite App - el hilo conductor</w:t>
-      </w:r>
-    </w:p>
-    <w:p>
-      <w:pPr>
-        <w:pStyle w:val="ListNumber"/>
-      </w:pPr>
-      <w:r>
-        <w:rPr>
-          <w:b w:val="0"/>
-          <w:color w:val="4A4A49"/>
-          <w:sz w:val="22"/>
-        </w:rPr>
-        <w:t>De dominio a arquitectura (mini-metodo) (1/3)</w:t>
-      </w:r>
-    </w:p>
-    <w:p>
-      <w:pPr>
-        <w:pStyle w:val="ListNumber"/>
-      </w:pPr>
-      <w:r>
-        <w:rPr>
-          <w:b w:val="0"/>
-          <w:color w:val="4A4A49"/>
-          <w:sz w:val="22"/>
-        </w:rPr>
-        <w:t>De dominio a arquitectura (mini-metodo) (2/3)</w:t>
-      </w:r>
-    </w:p>
-    <w:p>
-      <w:pPr>
-        <w:pStyle w:val="ListNumber"/>
-      </w:pPr>
-      <w:r>
-        <w:rPr>
-          <w:b w:val="0"/>
-          <w:color w:val="4A4A49"/>
-          <w:sz w:val="22"/>
-        </w:rPr>
-        <w:t>De dominio a arquitectura (mini-metodo) (3/3)</w:t>
-      </w:r>
-    </w:p>
-    <w:p>
-      <w:pPr>
-        <w:pStyle w:val="ListNumber"/>
-      </w:pPr>
-      <w:r>
-        <w:rPr>
-          <w:b w:val="0"/>
-          <w:color w:val="4A4A49"/>
-          <w:sz w:val="22"/>
-        </w:rPr>
-        <w:t>Ejemplo de diagrama C4 - nivel Context</w:t>
-      </w:r>
-    </w:p>
-    <w:p>
-      <w:pPr>
-        <w:pStyle w:val="ListNumber"/>
-      </w:pPr>
-      <w:r>
-        <w:rPr>
-          <w:b w:val="0"/>
-          <w:color w:val="4A4A49"/>
-          <w:sz w:val="22"/>
-        </w:rPr>
-        <w:t>Preguntas frecuentes y cierre conceptual (1/2)</w:t>
-      </w:r>
-    </w:p>
-    <w:p>
-      <w:pPr>
-        <w:pStyle w:val="ListNumber"/>
-      </w:pPr>
-      <w:r>
-        <w:rPr>
-          <w:b w:val="0"/>
-          <w:color w:val="4A4A49"/>
-          <w:sz w:val="22"/>
-        </w:rPr>
-        <w:t>Preguntas frecuentes y cierre conceptual (2/2)</w:t>
+        <w:t>El C4 Context en Mermaid: el sistema es una sola caja</w:t>
       </w:r>
     </w:p>
     <w:p>
@@ -1188,7 +1670,7 @@
           <w:color w:val="1A1C1D"/>
           <w:sz w:val="32"/>
         </w:rPr>
-        <w:t>10–40 · Teoría Core (al servicio del taller) · desde [Slide 4]</w:t>
+        <w:t>10–40 · Teoría Core (al servicio del taller) · desde [Slide 5]</w:t>
       </w:r>
     </w:p>
     <w:p>
@@ -1219,7 +1701,7 @@
           <w:color w:val="4A4A49"/>
           <w:sz w:val="22"/>
         </w:rPr>
-        <w:t xml:space="preserve"> · [Slide 4]</w:t>
+        <w:t xml:space="preserve"> · [Slide 5]</w:t>
       </w:r>
     </w:p>
     <w:p>
@@ -1240,7 +1722,7 @@
           <w:color w:val="4A4A49"/>
           <w:sz w:val="22"/>
         </w:rPr>
-        <w:t xml:space="preserve"> · [Slide 5]</w:t>
+        <w:t xml:space="preserve"> · [Slide 6]</w:t>
       </w:r>
     </w:p>
     <w:p>
@@ -1261,7 +1743,7 @@
           <w:color w:val="4A4A49"/>
           <w:sz w:val="22"/>
         </w:rPr>
-        <w:t xml:space="preserve"> · [Slide 6]</w:t>
+        <w:t xml:space="preserve"> · [Slide 7]</w:t>
       </w:r>
     </w:p>
     <w:p>
@@ -1350,7 +1832,7 @@
           <w:color w:val="1A1C1D"/>
           <w:sz w:val="32"/>
         </w:rPr>
-        <w:t>40–55 · Demo en vivo · [Slide 20]</w:t>
+        <w:t>40–55 · Demo en vivo · [Slide 11]</w:t>
       </w:r>
     </w:p>
     <w:p>
@@ -2078,7 +2560,7 @@
           <w:color w:val="1A1C1D"/>
           <w:sz w:val="32"/>
         </w:rPr>
-        <w:t>115–120 · Cierre · [Slide 21]</w:t>
+        <w:t>115–120 · Cierre · [Slide 12]</w:t>
       </w:r>
     </w:p>
     <w:p>

</xml_diff>

<commit_message>
Palabras mas sencillas en el material de los cinco cursos y enunciado de Introduccion resumido con el informe como punto clave
Co-Authored-By: Claude Opus 5.5 <noreply@anthropic.com>
</commit_message>
<xml_diff>
--- a/Arquitectura de Sistemas Computacionales/Kit docente/Clase 1/Guion Docente Clase 1 - Introduccion a arquitecturas cloud.docx
+++ b/Arquitectura de Sistemas Computacionales/Kit docente/Clase 1/Guion Docente Clase 1 - Introduccion a arquitecturas cloud.docx
@@ -396,7 +396,7 @@
           <w:color w:val="4A4A49"/>
           <w:sz w:val="22"/>
         </w:rPr>
-        <w:t>DOMINIO fija en una linea el problema de negocio elegido (AgendaU, BiblioLite, InventarioLab, TurnosClinica, EventosCampus u otro del mismo tamano); un dominio generico (una red social, una tienda en linea sin mas detalle) hace imposible evaluar las decisiones de las clases siguientes, porque no hay nada concreto que arquitecturar.</w:t>
+        <w:t>DOMINIO fija en una linea el problema de negocio elegido (AgendaU, BiblioLite, InventarioLab, TurnosClinica, EventosCampus u otro del mismo tamano); un dominio generico (una red social, una tienda en linea sin mas detalle) hace imposible evaluar las decisiones de las clases siguientes, porque no hay nada concreto que disenar.</w:t>
       </w:r>
     </w:p>
     <w:p>
@@ -583,7 +583,7 @@
           <w:color w:val="4A4A49"/>
           <w:sz w:val="22"/>
         </w:rPr>
-        <w:t>El cambio economico que esto produce es lo relevante para la arquitectura, porque la infraestructura deja de ser una compra que se hace por adelantado y se amortiza a largo plazo, y pasa a ser un gasto operativo que cambia con cada decision de diseno.</w:t>
+        <w:t>El cambio economico que esto produce es lo relevante para la arquitectura, porque la infraestructura deja de ser una compra que se hace por adelantado y su costo se reparte en el tiempo, y pasa a ser un gasto operativo que cambia con cada decision de diseno.</w:t>
       </w:r>
     </w:p>
     <w:p>
@@ -1902,7 +1902,7 @@
           <w:color w:val="4A4A49"/>
           <w:sz w:val="22"/>
         </w:rPr>
-        <w:t>Agregue 2 monigotes a la izquierda (Usuario final, Administrador) con flechas rotuladas «consulta», «administra».</w:t>
+        <w:t>Agregue 2 figuras de persona a la izquierda (Usuario final, Administrador) con flechas rotuladas «consulta», «administra».</w:t>
       </w:r>
     </w:p>
     <w:p>

</xml_diff>